<commit_message>
Quórum votM/sinVoto en la plantilla de bienes + hora de inicio y de cierre en ambas
1) La plantilla de bienes (subida por el usuario) ya traía las tablas de quórum {#votM}/{#sinVoto} copiadas del formato de puntos, pero la app solo enviaba {#items} para ese esquema, así que salían vacías; ahora generarActaWord() envía votM/sinVoto en los dos esquemas. 2) La hora de inicio de sesión y el lugar existían como campo pero la plantilla tenía texto fijo 'XXhXX' / '(lugar o mediante sesión virtual)' en vez de tags; se reemplazó por {horaSesion}/{lugarSesion}. 3) Se agregó un campo y tag nuevos {horaCierre} para la hora de cierre de la sesión (antes texto fijo '___ h___'), con su input en el panel de datos del proceso. Verificado con docxtemplater+mammoth y con el generador real de la app vía Playwright en ambos esquemas, sin llaves huérfanas.
</commit_message>
<xml_diff>
--- a/calificacion/plantillas/Acta_de_adjudicacion.docx
+++ b/calificacion/plantillas/Acta_de_adjudicacion.docx
@@ -736,7 +736,7 @@
           <w:sz w:val="22"/>
           <w:szCs w:val="22"/>
         </w:rPr>
-        <w:t>El día {fechaAdj}, a las XXhXX horas, en la (lugar o mediante sesión virtual), se reúnen de manera los miembros de la Comisión de Calificación, convocados por su Presidente, a través de Secretaría el día xx de XX de XX.</w:t>
+        <w:t>El día {fechaAdj}, a las {horaSesion} horas, en {lugarSesion}, se reúnen de manera los miembros de la Comisión de Calificación, convocados por su Presidente, a través de Secretaría el día xx de XX de XX.</w:t>
       </w:r>
     </w:p>
     <w:p>
@@ -4146,7 +4146,7 @@
           <w:sz w:val="22"/>
           <w:szCs w:val="22"/>
         </w:rPr>
-        <w:t>No existiendo más puntos que tratar, se da por terminada la sesión a las ___ h___ horas. Se dispone a Secretaría notificar la presente resolución al adjudicatario y a los proponentes no adjudicados, y remitir el expediente a la Coordinación del FAP para la elaboración del instrumento jurídico correspondiente.</w:t>
+        <w:t>No existiendo más puntos que tratar, se da por terminada la sesión a las {horaCierre} horas. Se dispone a Secretaría notificar la presente resolución al adjudicatario y a los proponentes no adjudicados, y remitir el expediente a la Coordinación del FAP para la elaboración del instrumento jurídico correspondiente.</w:t>
       </w:r>
     </w:p>
     <w:p>

</xml_diff>

<commit_message>
Firmas en tabla de 4 columnas (grid) en vez de lista apilada, en ambas plantillas
El bloque de firmas salía en Word como una larga lista vertical (línea/nombre/rol/cargo repetido por miembro), muy distinto a la vista previa en pantalla que los agrupa en fila. Se reconstruyó ese bloque en ambas plantillas como una tabla sin bordes de 4 columnas fijas por grupo (voz y voto / voz sin voto), con línea de firma (borde superior de párrafo) + nombre + rol + cargo por celda, usando tags fijos v1..v4/s1..s4 (mismo patrón ya usado para el puntaje por miembro, documentado el límite de 4 en TAGS.md). Además se unificó la plantilla de bienes: sus firmas usaban {#comision} sin separar por voto; ahora usa el mismo formato v1..v4/s1..s4 que la de puntos. Reconstruido con python-docx (no cirugía de texto) para evitar corromper la tabla; verificado con docxtemplater+mammoth y con el generador real de la app vía Playwright, sin llaves huérfanas.
</commit_message>
<xml_diff>
--- a/calificacion/plantillas/Acta_de_adjudicacion.docx
+++ b/calificacion/plantillas/Acta_de_adjudicacion.docx
@@ -4211,116 +4211,632 @@
     </w:p>
     <w:p>
       <w:r>
-        <w:t>{#comision}</w:t>
+        <w:rPr>
+          <w:rFonts w:ascii="Titillium Web" w:hAnsi="Titillium Web" w:eastAsia="Arial" w:cs="Arial"/>
+          <w:b/>
+          <w:i w:val="0"/>
+          <w:sz w:val="22"/>
+        </w:rPr>
+        <w:t>Miembros con voz y voto:</w:t>
       </w:r>
     </w:p>
+    <w:tbl>
+      <w:tblPr>
+        <w:tblW w:type="dxa" w:w="9360"/>
+        <w:tblLook w:firstColumn="1" w:firstRow="1" w:lastColumn="0" w:lastRow="0" w:noHBand="0" w:noVBand="1" w:val="04A0"/>
+        <w:tblBorders>
+          <w:top w:val="nil"/>
+          <w:left w:val="nil"/>
+          <w:bottom w:val="nil"/>
+          <w:right w:val="nil"/>
+          <w:insideH w:val="nil"/>
+          <w:insideV w:val="nil"/>
+        </w:tblBorders>
+        <w:tblLayout w:type="fixed"/>
+      </w:tblPr>
+      <w:tblGrid>
+        <w:gridCol w:w="2339"/>
+        <w:gridCol w:w="2339"/>
+        <w:gridCol w:w="2339"/>
+        <w:gridCol w:w="2339"/>
+      </w:tblGrid>
+      <w:tr>
+        <w:tc>
+          <w:tcPr>
+            <w:tcW w:type="dxa" w:w="2340"/>
+          </w:tcPr>
+          <w:p>
+            <w:pPr>
+              <w:spacing w:before="360" w:after="40"/>
+              <w:jc w:val="center"/>
+              <w:pBdr>
+                <w:top w:val="single" w:sz="6" w:space="1" w:color="000000"/>
+              </w:pBdr>
+            </w:pPr>
+            <w:r/>
+            <w:r>
+              <w:rPr>
+                <w:rFonts w:ascii="Titillium Web" w:hAnsi="Titillium Web" w:eastAsia="Arial" w:cs="Arial"/>
+                <w:b w:val="0"/>
+                <w:i w:val="0"/>
+                <w:sz w:val="12"/>
+              </w:rPr>
+              <w:t xml:space="preserve"> </w:t>
+            </w:r>
+          </w:p>
+          <w:p>
+            <w:pPr>
+              <w:spacing w:after="0"/>
+              <w:jc w:val="center"/>
+            </w:pPr>
+            <w:r>
+              <w:rPr>
+                <w:rFonts w:ascii="Titillium Web" w:hAnsi="Titillium Web" w:eastAsia="Arial" w:cs="Arial"/>
+                <w:b/>
+                <w:i w:val="0"/>
+                <w:sz w:val="22"/>
+              </w:rPr>
+              <w:t>{v1nom}</w:t>
+            </w:r>
+          </w:p>
+          <w:p>
+            <w:pPr>
+              <w:spacing w:after="0"/>
+              <w:jc w:val="center"/>
+            </w:pPr>
+            <w:r>
+              <w:rPr>
+                <w:rFonts w:ascii="Titillium Web" w:hAnsi="Titillium Web" w:eastAsia="Arial" w:cs="Arial"/>
+                <w:b/>
+                <w:i w:val="0"/>
+                <w:sz w:val="21"/>
+              </w:rPr>
+              <w:t>{v1rol}</w:t>
+            </w:r>
+          </w:p>
+          <w:p>
+            <w:pPr>
+              <w:spacing w:after="0"/>
+              <w:jc w:val="center"/>
+            </w:pPr>
+            <w:r>
+              <w:rPr>
+                <w:rFonts w:ascii="Titillium Web" w:hAnsi="Titillium Web" w:eastAsia="Arial" w:cs="Arial"/>
+                <w:b w:val="0"/>
+                <w:i w:val="0"/>
+                <w:color w:val="6B7180"/>
+                <w:sz w:val="19"/>
+              </w:rPr>
+              <w:t>{v1cargo}</w:t>
+            </w:r>
+          </w:p>
+        </w:tc>
+        <w:tc>
+          <w:tcPr>
+            <w:tcW w:type="dxa" w:w="2340"/>
+          </w:tcPr>
+          <w:p>
+            <w:pPr>
+              <w:spacing w:before="360" w:after="40"/>
+              <w:jc w:val="center"/>
+              <w:pBdr>
+                <w:top w:val="single" w:sz="6" w:space="1" w:color="000000"/>
+              </w:pBdr>
+            </w:pPr>
+            <w:r/>
+            <w:r>
+              <w:rPr>
+                <w:rFonts w:ascii="Titillium Web" w:hAnsi="Titillium Web" w:eastAsia="Arial" w:cs="Arial"/>
+                <w:b w:val="0"/>
+                <w:i w:val="0"/>
+                <w:sz w:val="12"/>
+              </w:rPr>
+              <w:t xml:space="preserve"> </w:t>
+            </w:r>
+          </w:p>
+          <w:p>
+            <w:pPr>
+              <w:spacing w:after="0"/>
+              <w:jc w:val="center"/>
+            </w:pPr>
+            <w:r>
+              <w:rPr>
+                <w:rFonts w:ascii="Titillium Web" w:hAnsi="Titillium Web" w:eastAsia="Arial" w:cs="Arial"/>
+                <w:b/>
+                <w:i w:val="0"/>
+                <w:sz w:val="22"/>
+              </w:rPr>
+              <w:t>{v2nom}</w:t>
+            </w:r>
+          </w:p>
+          <w:p>
+            <w:pPr>
+              <w:spacing w:after="0"/>
+              <w:jc w:val="center"/>
+            </w:pPr>
+            <w:r>
+              <w:rPr>
+                <w:rFonts w:ascii="Titillium Web" w:hAnsi="Titillium Web" w:eastAsia="Arial" w:cs="Arial"/>
+                <w:b/>
+                <w:i w:val="0"/>
+                <w:sz w:val="21"/>
+              </w:rPr>
+              <w:t>{v2rol}</w:t>
+            </w:r>
+          </w:p>
+          <w:p>
+            <w:pPr>
+              <w:spacing w:after="0"/>
+              <w:jc w:val="center"/>
+            </w:pPr>
+            <w:r>
+              <w:rPr>
+                <w:rFonts w:ascii="Titillium Web" w:hAnsi="Titillium Web" w:eastAsia="Arial" w:cs="Arial"/>
+                <w:b w:val="0"/>
+                <w:i w:val="0"/>
+                <w:color w:val="6B7180"/>
+                <w:sz w:val="19"/>
+              </w:rPr>
+              <w:t>{v2cargo}</w:t>
+            </w:r>
+          </w:p>
+        </w:tc>
+        <w:tc>
+          <w:tcPr>
+            <w:tcW w:type="dxa" w:w="2340"/>
+          </w:tcPr>
+          <w:p>
+            <w:pPr>
+              <w:spacing w:before="360" w:after="40"/>
+              <w:jc w:val="center"/>
+              <w:pBdr>
+                <w:top w:val="single" w:sz="6" w:space="1" w:color="000000"/>
+              </w:pBdr>
+            </w:pPr>
+            <w:r/>
+            <w:r>
+              <w:rPr>
+                <w:rFonts w:ascii="Titillium Web" w:hAnsi="Titillium Web" w:eastAsia="Arial" w:cs="Arial"/>
+                <w:b w:val="0"/>
+                <w:i w:val="0"/>
+                <w:sz w:val="12"/>
+              </w:rPr>
+              <w:t xml:space="preserve"> </w:t>
+            </w:r>
+          </w:p>
+          <w:p>
+            <w:pPr>
+              <w:spacing w:after="0"/>
+              <w:jc w:val="center"/>
+            </w:pPr>
+            <w:r>
+              <w:rPr>
+                <w:rFonts w:ascii="Titillium Web" w:hAnsi="Titillium Web" w:eastAsia="Arial" w:cs="Arial"/>
+                <w:b/>
+                <w:i w:val="0"/>
+                <w:sz w:val="22"/>
+              </w:rPr>
+              <w:t>{v3nom}</w:t>
+            </w:r>
+          </w:p>
+          <w:p>
+            <w:pPr>
+              <w:spacing w:after="0"/>
+              <w:jc w:val="center"/>
+            </w:pPr>
+            <w:r>
+              <w:rPr>
+                <w:rFonts w:ascii="Titillium Web" w:hAnsi="Titillium Web" w:eastAsia="Arial" w:cs="Arial"/>
+                <w:b/>
+                <w:i w:val="0"/>
+                <w:sz w:val="21"/>
+              </w:rPr>
+              <w:t>{v3rol}</w:t>
+            </w:r>
+          </w:p>
+          <w:p>
+            <w:pPr>
+              <w:spacing w:after="0"/>
+              <w:jc w:val="center"/>
+            </w:pPr>
+            <w:r>
+              <w:rPr>
+                <w:rFonts w:ascii="Titillium Web" w:hAnsi="Titillium Web" w:eastAsia="Arial" w:cs="Arial"/>
+                <w:b w:val="0"/>
+                <w:i w:val="0"/>
+                <w:color w:val="6B7180"/>
+                <w:sz w:val="19"/>
+              </w:rPr>
+              <w:t>{v3cargo}</w:t>
+            </w:r>
+          </w:p>
+        </w:tc>
+        <w:tc>
+          <w:tcPr>
+            <w:tcW w:type="dxa" w:w="2340"/>
+          </w:tcPr>
+          <w:p>
+            <w:pPr>
+              <w:spacing w:before="360" w:after="40"/>
+              <w:jc w:val="center"/>
+              <w:pBdr>
+                <w:top w:val="single" w:sz="6" w:space="1" w:color="000000"/>
+              </w:pBdr>
+            </w:pPr>
+            <w:r/>
+            <w:r>
+              <w:rPr>
+                <w:rFonts w:ascii="Titillium Web" w:hAnsi="Titillium Web" w:eastAsia="Arial" w:cs="Arial"/>
+                <w:b w:val="0"/>
+                <w:i w:val="0"/>
+                <w:sz w:val="12"/>
+              </w:rPr>
+              <w:t xml:space="preserve"> </w:t>
+            </w:r>
+          </w:p>
+          <w:p>
+            <w:pPr>
+              <w:spacing w:after="0"/>
+              <w:jc w:val="center"/>
+            </w:pPr>
+            <w:r>
+              <w:rPr>
+                <w:rFonts w:ascii="Titillium Web" w:hAnsi="Titillium Web" w:eastAsia="Arial" w:cs="Arial"/>
+                <w:b/>
+                <w:i w:val="0"/>
+                <w:sz w:val="22"/>
+              </w:rPr>
+              <w:t>{v4nom}</w:t>
+            </w:r>
+          </w:p>
+          <w:p>
+            <w:pPr>
+              <w:spacing w:after="0"/>
+              <w:jc w:val="center"/>
+            </w:pPr>
+            <w:r>
+              <w:rPr>
+                <w:rFonts w:ascii="Titillium Web" w:hAnsi="Titillium Web" w:eastAsia="Arial" w:cs="Arial"/>
+                <w:b/>
+                <w:i w:val="0"/>
+                <w:sz w:val="21"/>
+              </w:rPr>
+              <w:t>{v4rol}</w:t>
+            </w:r>
+          </w:p>
+          <w:p>
+            <w:pPr>
+              <w:spacing w:after="0"/>
+              <w:jc w:val="center"/>
+            </w:pPr>
+            <w:r>
+              <w:rPr>
+                <w:rFonts w:ascii="Titillium Web" w:hAnsi="Titillium Web" w:eastAsia="Arial" w:cs="Arial"/>
+                <w:b w:val="0"/>
+                <w:i w:val="0"/>
+                <w:color w:val="6B7180"/>
+                <w:sz w:val="19"/>
+              </w:rPr>
+              <w:t>{v4cargo}</w:t>
+            </w:r>
+          </w:p>
+        </w:tc>
+      </w:tr>
+    </w:tbl>
     <w:p>
-      <w:pPr>
-        <w:pStyle w:val="Textoindependiente3"/>
-        <w:tabs>
-          <w:tab w:val="left" w:pos="426"/>
-        </w:tabs>
-        <w:ind w:right="235"/>
-        <w:jc w:val="both"/>
-        <w:rPr>
-          <w:rFonts w:ascii="Titillium Web" w:hAnsi="Titillium Web"/>
-          <w:bCs/>
-          <w:sz w:val="22"/>
-          <w:szCs w:val="22"/>
-        </w:rPr>
-      </w:pPr>
       <w:r>
         <w:rPr>
-          <w:rFonts w:ascii="Titillium Web" w:hAnsi="Titillium Web"/>
-          <w:bCs/>
-          <w:sz w:val="22"/>
-          <w:szCs w:val="22"/>
-        </w:rPr>
-        <w:t>______________________________________</w:t>
+          <w:rFonts w:ascii="Titillium Web" w:hAnsi="Titillium Web" w:eastAsia="Arial" w:cs="Arial"/>
+          <w:b/>
+          <w:i w:val="0"/>
+          <w:sz w:val="22"/>
+        </w:rPr>
+        <w:t>Miembros con voz sin voto:</w:t>
       </w:r>
     </w:p>
-    <w:p>
-      <w:pPr>
-        <w:pStyle w:val="Textoindependiente3"/>
-        <w:tabs>
-          <w:tab w:val="left" w:pos="426"/>
-        </w:tabs>
-        <w:ind w:right="235"/>
-        <w:jc w:val="both"/>
-        <w:rPr>
-          <w:rFonts w:ascii="Titillium Web" w:hAnsi="Titillium Web"/>
-          <w:bCs/>
-          <w:sz w:val="22"/>
-          <w:szCs w:val="22"/>
-        </w:rPr>
-      </w:pPr>
-      <w:r>
-        <w:rPr>
-          <w:rFonts w:ascii="Titillium Web" w:hAnsi="Titillium Web"/>
-          <w:bCs/>
-          <w:sz w:val="22"/>
-          <w:szCs w:val="22"/>
-        </w:rPr>
-        <w:t>{nombre}</w:t>
-      </w:r>
-    </w:p>
-    <w:p>
-      <w:pPr>
-        <w:pStyle w:val="Textoindependiente3"/>
-        <w:tabs>
-          <w:tab w:val="left" w:pos="426"/>
-        </w:tabs>
-        <w:ind w:right="235"/>
-        <w:jc w:val="both"/>
-        <w:rPr>
-          <w:rFonts w:ascii="Titillium Web" w:hAnsi="Titillium Web"/>
-          <w:bCs/>
-          <w:sz w:val="22"/>
-          <w:szCs w:val="22"/>
-        </w:rPr>
-      </w:pPr>
-      <w:r>
-        <w:rPr>
-          <w:rFonts w:ascii="Titillium Web" w:hAnsi="Titillium Web"/>
-          <w:bCs/>
-          <w:sz w:val="22"/>
-          <w:szCs w:val="22"/>
-        </w:rPr>
-        <w:t>{rol}</w:t>
-      </w:r>
-    </w:p>
-    <w:p>
-      <w:pPr>
-        <w:pStyle w:val="Textoindependiente3"/>
-        <w:tabs>
-          <w:tab w:val="left" w:pos="426"/>
-        </w:tabs>
-        <w:ind w:right="235"/>
-        <w:jc w:val="both"/>
-        <w:rPr>
-          <w:rFonts w:ascii="Titillium Web" w:hAnsi="Titillium Web"/>
-          <w:b w:val="0"/>
-          <w:bCs/>
-          <w:i/>
-          <w:sz w:val="22"/>
-          <w:szCs w:val="22"/>
-        </w:rPr>
-      </w:pPr>
-      <w:r>
-        <w:rPr>
-          <w:rFonts w:ascii="Titillium Web" w:hAnsi="Titillium Web"/>
-          <w:bCs/>
-          <w:sz w:val="22"/>
-          <w:szCs w:val="22"/>
-        </w:rPr>
-        <w:t>{cargo}</w:t>
-      </w:r>
-    </w:p>
-    <w:p>
-      <w:r>
-        <w:t>{/comision}</w:t>
-      </w:r>
-    </w:p>
+    <w:tbl>
+      <w:tblPr>
+        <w:tblW w:type="dxa" w:w="9360"/>
+        <w:tblLook w:firstColumn="1" w:firstRow="1" w:lastColumn="0" w:lastRow="0" w:noHBand="0" w:noVBand="1" w:val="04A0"/>
+        <w:tblBorders>
+          <w:top w:val="nil"/>
+          <w:left w:val="nil"/>
+          <w:bottom w:val="nil"/>
+          <w:right w:val="nil"/>
+          <w:insideH w:val="nil"/>
+          <w:insideV w:val="nil"/>
+        </w:tblBorders>
+        <w:tblLayout w:type="fixed"/>
+      </w:tblPr>
+      <w:tblGrid>
+        <w:gridCol w:w="2339"/>
+        <w:gridCol w:w="2339"/>
+        <w:gridCol w:w="2339"/>
+        <w:gridCol w:w="2339"/>
+      </w:tblGrid>
+      <w:tr>
+        <w:tc>
+          <w:tcPr>
+            <w:tcW w:type="dxa" w:w="2340"/>
+          </w:tcPr>
+          <w:p>
+            <w:pPr>
+              <w:spacing w:before="360" w:after="40"/>
+              <w:jc w:val="center"/>
+              <w:pBdr>
+                <w:top w:val="single" w:sz="6" w:space="1" w:color="000000"/>
+              </w:pBdr>
+            </w:pPr>
+            <w:r/>
+            <w:r>
+              <w:rPr>
+                <w:rFonts w:ascii="Titillium Web" w:hAnsi="Titillium Web" w:eastAsia="Arial" w:cs="Arial"/>
+                <w:b w:val="0"/>
+                <w:i w:val="0"/>
+                <w:sz w:val="12"/>
+              </w:rPr>
+              <w:t xml:space="preserve"> </w:t>
+            </w:r>
+          </w:p>
+          <w:p>
+            <w:pPr>
+              <w:spacing w:after="0"/>
+              <w:jc w:val="center"/>
+            </w:pPr>
+            <w:r>
+              <w:rPr>
+                <w:rFonts w:ascii="Titillium Web" w:hAnsi="Titillium Web" w:eastAsia="Arial" w:cs="Arial"/>
+                <w:b/>
+                <w:i w:val="0"/>
+                <w:sz w:val="22"/>
+              </w:rPr>
+              <w:t>{s1nom}</w:t>
+            </w:r>
+          </w:p>
+          <w:p>
+            <w:pPr>
+              <w:spacing w:after="0"/>
+              <w:jc w:val="center"/>
+            </w:pPr>
+            <w:r>
+              <w:rPr>
+                <w:rFonts w:ascii="Titillium Web" w:hAnsi="Titillium Web" w:eastAsia="Arial" w:cs="Arial"/>
+                <w:b/>
+                <w:i w:val="0"/>
+                <w:sz w:val="21"/>
+              </w:rPr>
+              <w:t>{s1rol}</w:t>
+            </w:r>
+          </w:p>
+          <w:p>
+            <w:pPr>
+              <w:spacing w:after="0"/>
+              <w:jc w:val="center"/>
+            </w:pPr>
+            <w:r>
+              <w:rPr>
+                <w:rFonts w:ascii="Titillium Web" w:hAnsi="Titillium Web" w:eastAsia="Arial" w:cs="Arial"/>
+                <w:b w:val="0"/>
+                <w:i w:val="0"/>
+                <w:color w:val="6B7180"/>
+                <w:sz w:val="19"/>
+              </w:rPr>
+              <w:t>{s1cargo}</w:t>
+            </w:r>
+          </w:p>
+        </w:tc>
+        <w:tc>
+          <w:tcPr>
+            <w:tcW w:type="dxa" w:w="2340"/>
+          </w:tcPr>
+          <w:p>
+            <w:pPr>
+              <w:spacing w:before="360" w:after="40"/>
+              <w:jc w:val="center"/>
+              <w:pBdr>
+                <w:top w:val="single" w:sz="6" w:space="1" w:color="000000"/>
+              </w:pBdr>
+            </w:pPr>
+            <w:r/>
+            <w:r>
+              <w:rPr>
+                <w:rFonts w:ascii="Titillium Web" w:hAnsi="Titillium Web" w:eastAsia="Arial" w:cs="Arial"/>
+                <w:b w:val="0"/>
+                <w:i w:val="0"/>
+                <w:sz w:val="12"/>
+              </w:rPr>
+              <w:t xml:space="preserve"> </w:t>
+            </w:r>
+          </w:p>
+          <w:p>
+            <w:pPr>
+              <w:spacing w:after="0"/>
+              <w:jc w:val="center"/>
+            </w:pPr>
+            <w:r>
+              <w:rPr>
+                <w:rFonts w:ascii="Titillium Web" w:hAnsi="Titillium Web" w:eastAsia="Arial" w:cs="Arial"/>
+                <w:b/>
+                <w:i w:val="0"/>
+                <w:sz w:val="22"/>
+              </w:rPr>
+              <w:t>{s2nom}</w:t>
+            </w:r>
+          </w:p>
+          <w:p>
+            <w:pPr>
+              <w:spacing w:after="0"/>
+              <w:jc w:val="center"/>
+            </w:pPr>
+            <w:r>
+              <w:rPr>
+                <w:rFonts w:ascii="Titillium Web" w:hAnsi="Titillium Web" w:eastAsia="Arial" w:cs="Arial"/>
+                <w:b/>
+                <w:i w:val="0"/>
+                <w:sz w:val="21"/>
+              </w:rPr>
+              <w:t>{s2rol}</w:t>
+            </w:r>
+          </w:p>
+          <w:p>
+            <w:pPr>
+              <w:spacing w:after="0"/>
+              <w:jc w:val="center"/>
+            </w:pPr>
+            <w:r>
+              <w:rPr>
+                <w:rFonts w:ascii="Titillium Web" w:hAnsi="Titillium Web" w:eastAsia="Arial" w:cs="Arial"/>
+                <w:b w:val="0"/>
+                <w:i w:val="0"/>
+                <w:color w:val="6B7180"/>
+                <w:sz w:val="19"/>
+              </w:rPr>
+              <w:t>{s2cargo}</w:t>
+            </w:r>
+          </w:p>
+        </w:tc>
+        <w:tc>
+          <w:tcPr>
+            <w:tcW w:type="dxa" w:w="2340"/>
+          </w:tcPr>
+          <w:p>
+            <w:pPr>
+              <w:spacing w:before="360" w:after="40"/>
+              <w:jc w:val="center"/>
+              <w:pBdr>
+                <w:top w:val="single" w:sz="6" w:space="1" w:color="000000"/>
+              </w:pBdr>
+            </w:pPr>
+            <w:r/>
+            <w:r>
+              <w:rPr>
+                <w:rFonts w:ascii="Titillium Web" w:hAnsi="Titillium Web" w:eastAsia="Arial" w:cs="Arial"/>
+                <w:b w:val="0"/>
+                <w:i w:val="0"/>
+                <w:sz w:val="12"/>
+              </w:rPr>
+              <w:t xml:space="preserve"> </w:t>
+            </w:r>
+          </w:p>
+          <w:p>
+            <w:pPr>
+              <w:spacing w:after="0"/>
+              <w:jc w:val="center"/>
+            </w:pPr>
+            <w:r>
+              <w:rPr>
+                <w:rFonts w:ascii="Titillium Web" w:hAnsi="Titillium Web" w:eastAsia="Arial" w:cs="Arial"/>
+                <w:b/>
+                <w:i w:val="0"/>
+                <w:sz w:val="22"/>
+              </w:rPr>
+              <w:t>{s3nom}</w:t>
+            </w:r>
+          </w:p>
+          <w:p>
+            <w:pPr>
+              <w:spacing w:after="0"/>
+              <w:jc w:val="center"/>
+            </w:pPr>
+            <w:r>
+              <w:rPr>
+                <w:rFonts w:ascii="Titillium Web" w:hAnsi="Titillium Web" w:eastAsia="Arial" w:cs="Arial"/>
+                <w:b/>
+                <w:i w:val="0"/>
+                <w:sz w:val="21"/>
+              </w:rPr>
+              <w:t>{s3rol}</w:t>
+            </w:r>
+          </w:p>
+          <w:p>
+            <w:pPr>
+              <w:spacing w:after="0"/>
+              <w:jc w:val="center"/>
+            </w:pPr>
+            <w:r>
+              <w:rPr>
+                <w:rFonts w:ascii="Titillium Web" w:hAnsi="Titillium Web" w:eastAsia="Arial" w:cs="Arial"/>
+                <w:b w:val="0"/>
+                <w:i w:val="0"/>
+                <w:color w:val="6B7180"/>
+                <w:sz w:val="19"/>
+              </w:rPr>
+              <w:t>{s3cargo}</w:t>
+            </w:r>
+          </w:p>
+        </w:tc>
+        <w:tc>
+          <w:tcPr>
+            <w:tcW w:type="dxa" w:w="2340"/>
+          </w:tcPr>
+          <w:p>
+            <w:pPr>
+              <w:spacing w:before="360" w:after="40"/>
+              <w:jc w:val="center"/>
+              <w:pBdr>
+                <w:top w:val="single" w:sz="6" w:space="1" w:color="000000"/>
+              </w:pBdr>
+            </w:pPr>
+            <w:r/>
+            <w:r>
+              <w:rPr>
+                <w:rFonts w:ascii="Titillium Web" w:hAnsi="Titillium Web" w:eastAsia="Arial" w:cs="Arial"/>
+                <w:b w:val="0"/>
+                <w:i w:val="0"/>
+                <w:sz w:val="12"/>
+              </w:rPr>
+              <w:t xml:space="preserve"> </w:t>
+            </w:r>
+          </w:p>
+          <w:p>
+            <w:pPr>
+              <w:spacing w:after="0"/>
+              <w:jc w:val="center"/>
+            </w:pPr>
+            <w:r>
+              <w:rPr>
+                <w:rFonts w:ascii="Titillium Web" w:hAnsi="Titillium Web" w:eastAsia="Arial" w:cs="Arial"/>
+                <w:b/>
+                <w:i w:val="0"/>
+                <w:sz w:val="22"/>
+              </w:rPr>
+              <w:t>{s4nom}</w:t>
+            </w:r>
+          </w:p>
+          <w:p>
+            <w:pPr>
+              <w:spacing w:after="0"/>
+              <w:jc w:val="center"/>
+            </w:pPr>
+            <w:r>
+              <w:rPr>
+                <w:rFonts w:ascii="Titillium Web" w:hAnsi="Titillium Web" w:eastAsia="Arial" w:cs="Arial"/>
+                <w:b/>
+                <w:i w:val="0"/>
+                <w:sz w:val="21"/>
+              </w:rPr>
+              <w:t>{s4rol}</w:t>
+            </w:r>
+          </w:p>
+          <w:p>
+            <w:pPr>
+              <w:spacing w:after="0"/>
+              <w:jc w:val="center"/>
+            </w:pPr>
+            <w:r>
+              <w:rPr>
+                <w:rFonts w:ascii="Titillium Web" w:hAnsi="Titillium Web" w:eastAsia="Arial" w:cs="Arial"/>
+                <w:b w:val="0"/>
+                <w:i w:val="0"/>
+                <w:color w:val="6B7180"/>
+                <w:sz w:val="19"/>
+              </w:rPr>
+              <w:t>{s4cargo}</w:t>
+            </w:r>
+          </w:p>
+        </w:tc>
+      </w:tr>
+    </w:tbl>
     <w:p>
       <w:pPr>
         <w:pStyle w:val="Textoindependiente3"/>

</xml_diff>